<commit_message>
Make Mind Clarity a self-guided philosophy and practice experience
</commit_message>
<xml_diff>
--- a/Uday_Philosophy.docx
+++ b/Uday_Philosophy.docx
@@ -270,7 +270,7 @@
         <w:pStyle w:val="Heading2"/>
       </w:pPr>
       <w:r>
-        <w:t>Upanishadic foundations for the identity of Atman and Brahman</w:t>
+        <w:t>Vedic and Upanishadic foundations</w:t>
       </w:r>
     </w:p>
     <w:p>
@@ -315,7 +315,7 @@
         <w:pStyle w:val="ListBullet"/>
       </w:pPr>
       <w:r>
-        <w:t>So’ham — “I am That.” (Aham-Sa / So’ham language associated with the Isha tradition and broader Upanishadic usage; translations and verse references should be checked before formal publication)</w:t>
+        <w:t>So’ham Asmi — “That person there—I am he.” (Isha Upanishad 16; Shukla Yajur Veda 40.16)</w:t>
       </w:r>
     </w:p>
     <w:p>
@@ -701,7 +701,116 @@
     </w:p>
     <w:p>
       <w:r>
-        <w:t>The Mind Clarity website is the practical public doorway for this philosophy. The philosophy page should communicate the central ideas with warmth and clarity, while service pages should describe actual offerings accurately. Future programmes, proposed technologies, historical experiments, scientific claims, and established beliefs must remain clearly separated.</w:t>
+        <w:t>The Mind Clarity website is itself a place of learning and enquiry, not primarily a doorway to Uday’s services. Its purpose is to support understanding and the aspiration toward enlightenment through the website itself. Visitors should be able to read the full philosophy, examine an everyday difficulty, practise independently, and choose a responsible next step without Uday’s personal help. This describes the purpose of the experience, not a guaranteed spiritual outcome.</w:t>
+      </w:r>
+    </w:p>
+    <w:p>
+      <w:pPr>
+        <w:pStyle w:val="Heading2"/>
+      </w:pPr>
+      <w:r>
+        <w:t>Governing website principle — 18 September 2026</w:t>
+      </w:r>
+    </w:p>
+    <w:p>
+      <w:pPr>
+        <w:pStyle w:val="UdayQuote"/>
+      </w:pPr>
+      <w:r>
+        <w:t>“The website should enlighten them with the website itself without my help. That should be the design language of the website.”</w:t>
+      </w:r>
+    </w:p>
+    <w:p>
+      <w:pPr>
+        <w:pStyle w:val="SmallNote"/>
+      </w:pPr>
+      <w:r>
+        <w:rPr>
+          <w:b/>
+        </w:rPr>
+        <w:t>UDAY’S CURRENT DIRECTION; TAKES PRECEDENCE OVER EARLIER CONSULTATION-LED WEBSITE PLANS</w:t>
+      </w:r>
+    </w:p>
+    <w:p>
+      <w:pPr>
+        <w:pStyle w:val="ListBullet"/>
+      </w:pPr>
+      <w:r>
+        <w:t>Lead with the visitor’s experience, not a personal profile or consultation offer. Begin with a useful reflection that can be tried immediately.</w:t>
+      </w:r>
+    </w:p>
+    <w:p>
+      <w:pPr>
+        <w:pStyle w:val="ListBullet"/>
+      </w:pPr>
+      <w:r>
+        <w:t>Use a clear learning path: notice an experience, understand the relevant idea, examine an ordinary example, try an action, and review what changed. Every main lesson should connect understanding with practice.</w:t>
+      </w:r>
+    </w:p>
+    <w:p>
+      <w:pPr>
+        <w:pStyle w:val="ListBullet"/>
+      </w:pPr>
+      <w:r>
+        <w:t>Make the complete core philosophy freely readable on the page: the original Mula Siddhanta, one Shakti, the two levels, witnessing, surrender, Bhakti and Jnana, discernment, scriptural pointers, responsibility, and the Beautiful World vision.</w:t>
+      </w:r>
+    </w:p>
+    <w:p>
+      <w:pPr>
+        <w:pStyle w:val="ListBullet"/>
+      </w:pPr>
+      <w:r>
+        <w:t>Use calm, readable, mobile-friendly pages, meaningful headings, contents links, concrete examples, reflection prompts, and clear next steps. The design should feel like a learning companion rather than a sales page.</w:t>
+      </w:r>
+    </w:p>
+    <w:p>
+      <w:pPr>
+        <w:pStyle w:val="ListBullet"/>
+      </w:pPr>
+      <w:r>
+        <w:t>Visitors must not need to book, pay, register, submit personal information, or contact Uday to benefit from the learning content. Preserve independent judgment and freedom to disagree.</w:t>
+      </w:r>
+    </w:p>
+    <w:p>
+      <w:pPr>
+        <w:pStyle w:val="ListBullet"/>
+      </w:pPr>
+      <w:r>
+        <w:t>Remove consultation priority, promotional booking calls to action, and a separate About Me focus. Keep email unobtrusive in the footer; any personal conversation is a quiet, optional last step.</w:t>
+      </w:r>
+    </w:p>
+    <w:p>
+      <w:pPr>
+        <w:pStyle w:val="ListBullet"/>
+      </w:pPr>
+      <w:r>
+        <w:t>Do not add a donation button now. If requested later, place it quietly at the very bottom without competing with the learning experience.</w:t>
+      </w:r>
+    </w:p>
+    <w:p>
+      <w:pPr>
+        <w:pStyle w:val="ListBullet"/>
+      </w:pPr>
+      <w:r>
+        <w:t>Keep proposals, beliefs, practical observations, and evidence-based claims distinct. Support care, accountability, boundaries, and appropriate professional help; do not promise cures or guaranteed enlightenment.</w:t>
+      </w:r>
+    </w:p>
+    <w:p>
+      <w:pPr>
+        <w:pStyle w:val="Heading2"/>
+      </w:pPr>
+      <w:r>
+        <w:t>Design acceptance test</w:t>
+      </w:r>
+    </w:p>
+    <w:p>
+      <w:r>
+        <w:t>Can a visitor understand an idea, reflect on their own situation, and identify one constructive next action without contacting Uday? If a page only describes the philosophy or promotes a conversation but does not help the visitor use the understanding, it is incomplete. Primary navigation and prominent links should lead to learning and practice, not booking.</w:t>
+      </w:r>
+    </w:p>
+    <w:p>
+      <w:r>
+        <w:t>The public learning exercises are editorial applications of the reference philosophy, not claimed historical teachings or proof of outcomes. Future programmes, proposed technologies, historical experiments, scientific claims, and established beliefs must remain clearly separated.</w:t>
       </w:r>
     </w:p>
     <w:p>
@@ -896,7 +1005,7 @@
     </w:p>
     <w:p>
       <w:r>
-        <w:t>Primary source: Uday Kumar, “A Beautiful World,” Mind Clarity Consultant, version 2, 16 September 2026, including the supplied Mula Siddhanta and benefit guardrails. This organized document also incorporates the Mind Clarity website context developed in ChatGPT Work and Codex. Version 1.0 • 18 September 2026.</w:t>
+        <w:t>Primary source: Uday Kumar, “A Beautiful World,” Mind Clarity Consultant, version 2, 16 September 2026, including the supplied Mula Siddhanta and benefit guardrails. This organized document also incorporates the Mind Clarity website context developed in ChatGPT Work and Codex. Version 1.1 • 18 September 2026. This revision records Uday’s explicit self-guided website principle, design language, and consultation/deferred-donation priorities in section 7; the original root principle remains unchanged. The So’ham Asmi reference is clarified to Isha Upanishad 16; text reference: https://sri-aurobindo.co.in/workings/sa/12/isha_e.pdf.</w:t>
       </w:r>
     </w:p>
     <w:sectPr>
@@ -1640,9 +1749,6 @@
     <w:qFormat/>
     <w:rsid w:val="00FC693F"/>
     <w:pPr>
-      <w:pBdr>
-        <w:bottom w:val="single" w:sz="8" w:space="4" w:color="4F81BD" w:themeColor="accent1"/>
-      </w:pBdr>
       <w:spacing w:after="100" w:line="240" w:lineRule="auto" w:before="180"/>
       <w:contextualSpacing/>
     </w:pPr>

</xml_diff>

<commit_message>
Align teaching around Creator and game
</commit_message>
<xml_diff>
--- a/Uday_Philosophy.docx
+++ b/Uday_Philosophy.docx
@@ -20,7 +20,7 @@
     </w:p>
     <w:p>
       <w:r>
-        <w:t>A structured record of the Mula Siddhanta, the Mind Clarity approach, and the Beautiful World vision</w:t>
+        <w:t>The Creator and the game of experiences</w:t>
       </w:r>
     </w:p>
     <w:p>
@@ -28,7 +28,7 @@
         <w:pStyle w:val="SmallNote"/>
       </w:pPr>
       <w:r>
-        <w:t>Prepared for continuity across ChatGPT Work and Codex</w:t>
+        <w:t>Reference for the website, daily practices, future videos, and teaching materials</w:t>
       </w:r>
     </w:p>
     <w:p>
@@ -36,7 +36,7 @@
         <w:pStyle w:val="SmallNote"/>
       </w:pPr>
       <w:r>
-        <w:t>Uday Kumar  •  Mind Clarity Consultant  •  18 September 2026</w:t>
+        <w:t>Uday Kumar  •  23 September 2026  •  Version 1.5</w:t>
       </w:r>
     </w:p>
     <w:p>
@@ -44,7 +44,7 @@
         <w:pStyle w:val="Heading2"/>
       </w:pPr>
       <w:r>
-        <w:t>Central intention</w:t>
+        <w:t>The governing statement</w:t>
       </w:r>
     </w:p>
     <w:p>
@@ -52,7 +52,12 @@
         <w:pStyle w:val="UdayQuote"/>
       </w:pPr>
       <w:r>
-        <w:t>My main goal is to make this world a beautiful place to live in, so that in that beautiful place I can live happily.</w:t>
+        <w:t>We are the Creator. We created this game of experiences and entered it. Having designed it before entering, we cannot change its design from inside the game.</w:t>
+      </w:r>
+    </w:p>
+    <w:p>
+      <w:r>
+        <w:t>In Uday Kumar’s philosophy, God, the Creator, and the one Shakti point to the shared source appearing as every life. ‘We are the Creator’ refers to this common identity beyond our separate personalities. Remembering, choosing, learning, and caring all take place within the game’s unfolding; none places an individual outside it to rewrite the total design.</w:t>
       </w:r>
     </w:p>
     <w:p>
@@ -60,12 +65,12 @@
         <w:pStyle w:val="Heading2"/>
       </w:pPr>
       <w:r>
-        <w:t>How to read this document</w:t>
+        <w:t>Purpose of this reference</w:t>
       </w:r>
     </w:p>
     <w:p>
       <w:r>
-        <w:t>This document gathers the philosophy expressed in the saved “A Beautiful World” guide and the Mind Clarity context. It separates four kinds of content: original statements attributed to Uday; explanatory interpretations; proposed practices or future ideas; and safety or evidence guardrails. This distinction keeps the record faithful while making it useful for future website, teaching, and product work.</w:t>
+        <w:t>Every explanation, example, and exercise develops this central understanding. The intended state of mind is remembrance of the Creator while participating in the game. In Uday’s teaching, care for relationships and creation arises through that recognition. The reference records his spiritual philosophy, the explanations used to communicate it, and the direction of future content.</w:t>
       </w:r>
     </w:p>
     <w:p>
@@ -73,7 +78,7 @@
         <w:pStyle w:val="SmallNote"/>
       </w:pPr>
       <w:r>
-        <w:t>Status: working philosophy document. It is a living reference, not a scientific proof, religious authority, clinical treatment, or promise of outcomes.</w:t>
+        <w:t>The original Mula Siddhanta is preserved verbatim. Analogies and exercises explore the teaching; they do not independently prove its cosmology or guarantee emotional, health, or financial outcomes.</w:t>
       </w:r>
     </w:p>
     <w:p>
@@ -91,62 +96,62 @@
     </w:p>
     <w:p>
       <w:r>
-        <w:t>1. Purpose and identity</w:t>
+        <w:t>1 Purpose and identity</w:t>
       </w:r>
     </w:p>
     <w:p>
       <w:r>
-        <w:t>2. Mula Siddhanta — the root principle</w:t>
+        <w:t>2 Mula Siddhanta and the completed design</w:t>
       </w:r>
     </w:p>
     <w:p>
       <w:r>
-        <w:t>3. Four paths to self-knowledge</w:t>
+        <w:t>3 Four paths to the same recognition</w:t>
       </w:r>
     </w:p>
     <w:p>
       <w:r>
-        <w:t>4. Sthitaprajna — steady wisdom</w:t>
+        <w:t>4 Sthitaprajna and steady remembrance</w:t>
       </w:r>
     </w:p>
     <w:p>
       <w:r>
-        <w:t>5. The structure of experience</w:t>
+        <w:t>5 Experiencing the game</w:t>
       </w:r>
     </w:p>
     <w:p>
       <w:r>
-        <w:t>6. Core practices and human relationships</w:t>
+        <w:t>6 Practices and everyday examples</w:t>
       </w:r>
     </w:p>
     <w:p>
       <w:r>
-        <w:t>7. Intended effects and responsible boundaries</w:t>
+        <w:t>7 Intended effects and honest enquiry</w:t>
       </w:r>
     </w:p>
     <w:p>
       <w:r>
-        <w:t>8. The Beautiful World vision</w:t>
+        <w:t>8 The Beautiful World vision</w:t>
       </w:r>
     </w:p>
     <w:p>
       <w:r>
-        <w:t>9. Mind Clarity as practice and teaching</w:t>
+        <w:t>9 Teaching through the website</w:t>
       </w:r>
     </w:p>
     <w:p>
       <w:r>
-        <w:t>10. Practical experiments and communication</w:t>
+        <w:t>10 Future videos and communication</w:t>
       </w:r>
     </w:p>
     <w:p>
       <w:r>
-        <w:t>11. AI collaboration and project continuity</w:t>
+        <w:t>11 Project continuity</w:t>
       </w:r>
     </w:p>
     <w:p>
       <w:r>
-        <w:t>12. Working summary and open questions</w:t>
+        <w:t>12 Summary and version record</w:t>
       </w:r>
     </w:p>
     <w:p>
@@ -159,17 +164,27 @@
         <w:pStyle w:val="Heading1"/>
       </w:pPr>
       <w:r>
-        <w:t>1. Purpose and identity</w:t>
+        <w:t>1 Purpose and identity</w:t>
       </w:r>
     </w:p>
     <w:p>
       <w:r>
-        <w:t>Mind Clarity is the practical expression of a deeper wish: to live in a world that is more beautiful, kind, clear, and supportive of life. Its central teaching is creator-awareness: we are the creators who created this game and entered it. The philosophy is intended to shape how people understand experience, respond to difficulty, relate to one another, use technology, and create conditions for joyful living.</w:t>
+        <w:t>The governing teaching is that we are the Creator who made this game of experiences and entered it. Having designed it before entering, we cannot change the design from inside. This complete statement is the starting point for Mind Clarity, not a phrase added after an independent lesson about behaviour.</w:t>
       </w:r>
     </w:p>
     <w:p>
       <w:r>
-        <w:t>The role attached to this work is Mind Clarity Consultant. The work may include reflective conversation, spiritual sharing, practical exercises, educational content, website communication, and exploration of how AI and robotics can reduce unnecessary burdens. The philosophy should remain open to sincere questioning and should never require agreement as a condition for respect.</w:t>
+        <w:t>“We” points to the one shared source, God or Shakti, appearing through all lives and roles. It does not identify one individual personality as superior or able to control other people. Recognition includes the person who disagrees with us.</w:t>
+      </w:r>
+    </w:p>
+    <w:p>
+      <w:r>
+        <w:t>Uday wants the understanding to become a lived state of mind. His emphasis is on knowing who we are, beyond merely repeating a belief. In this teaching, responsibility and care arise naturally from recognition; they are not the separate instructions around which the lessons are organized.</w:t>
+      </w:r>
+    </w:p>
+    <w:p>
+      <w:r>
+        <w:t>The intended movement is from the central understanding into a scene of experience, recognition of the role that has absorbed attention, remembrance of the shared Creator, and participation within the unfolding game. Every educational element should make this connection understandable.</w:t>
       </w:r>
     </w:p>
     <w:p>
@@ -177,7 +192,7 @@
         <w:pStyle w:val="Heading2"/>
       </w:pPr>
       <w:r>
-        <w:t>Working distinctions</w:t>
+        <w:t>Kinds of content</w:t>
       </w:r>
     </w:p>
     <w:p>
@@ -185,7 +200,7 @@
         <w:pStyle w:val="ListBullet"/>
       </w:pPr>
       <w:r>
-        <w:t>Original belief: a statement directly expressed by Uday, especially the Mula Siddhanta and central intention.</w:t>
+        <w:t>Original statement: wording supplied by Uday, especially the Mula Siddhanta and the Beautiful World intention.</w:t>
       </w:r>
     </w:p>
     <w:p>
@@ -193,7 +208,7 @@
         <w:pStyle w:val="ListBullet"/>
       </w:pPr>
       <w:r>
-        <w:t>Interpretation: an explanation that helps communicate the belief without claiming it is independently proven.</w:t>
+        <w:t>Interpretation: an explanation connecting the statement to a scene, role, or relationship.</w:t>
       </w:r>
     </w:p>
     <w:p>
@@ -201,7 +216,7 @@
         <w:pStyle w:val="ListBullet"/>
       </w:pPr>
       <w:r>
-        <w:t>Proposal: a possible practice, programme, website feature, or future-world idea that still needs testing.</w:t>
+        <w:t>Practice: an invitation to examine the meaning of remembrance in experience.</w:t>
       </w:r>
     </w:p>
     <w:p>
@@ -209,7 +224,12 @@
         <w:pStyle w:val="ListBullet"/>
       </w:pPr>
       <w:r>
-        <w:t>Guardrail: a boundary against overclaiming, coercion, medical promises, or using spiritual ideas to dismiss real harm.</w:t>
+        <w:t>Proposal: future teaching or technology work that has not been established as an existing programme.</w:t>
+      </w:r>
+    </w:p>
+    <w:p>
+      <w:r>
+        <w:t>People may examine and question this worldview. The Creator and the designed game are spiritual claims; a useful exercise or a feeling of calm does not establish them as scientific facts.</w:t>
       </w:r>
     </w:p>
     <w:p>
@@ -217,7 +237,7 @@
         <w:pStyle w:val="Heading1"/>
       </w:pPr>
       <w:r>
-        <w:t>2. Mula Siddhanta — the root principle</w:t>
+        <w:t>2 Mula Siddhanta and the completed design</w:t>
       </w:r>
     </w:p>
     <w:p>
@@ -228,7 +248,7 @@
         <w:rPr>
           <w:b/>
         </w:rPr>
-        <w:t>ORIGINAL WORDING SUPPLIED BY UDAY, 16 SEPTEMBER 2026</w:t>
+        <w:t>ORIGINAL WORDING SUPPLIED BY UDAY ON 16 SEPTEMBER 2026</w:t>
       </w:r>
     </w:p>
     <w:p>
@@ -241,7 +261,7 @@
     </w:p>
     <w:p>
       <w:r>
-        <w:t>In this root principle, existence begins as one capable energy. The many persons, roles, events, and experiences of life are expressions within the existence created by that energy. We are the creators who created this game and entered it to experience it. The course of the total design is understood as already decided before participation, so no separate individual can stand outside existence and rewrite the whole design midway.</w:t>
+        <w:t>In Uday’s account, the one Creator was alone and created multiplicity for experiences. We are that Creator within the different roles of the game. The source, creation, and deepest experiencer belong to one reality in this philosophy.</w:t>
       </w:r>
     </w:p>
     <w:p>
@@ -249,30 +269,27 @@
         <w:pStyle w:val="Heading2"/>
       </w:pPr>
       <w:r>
-        <w:t>Meaning and careful interpretation</w:t>
+        <w:t>Participation within a fixed design</w:t>
       </w:r>
     </w:p>
     <w:p>
       <w:r>
-        <w:t>The names Brahman, Parabrahman, Ishwara, Paramatman, Allah, God, and Yahweh are presented here as Uday’s way of pointing toward one ultimate source across different religious vocabularies. This is a personal synthesis, not a claim that all traditions agree that these names mean exactly the same thing. In this philosophy, the essential recognition is that we are the creators who created this game and entered it.</w:t>
+        <w:t>The total design cannot be rewritten after entry. Time, thoughts, decisions, effort, forgetting, remembrance, and learning are all understood as parts of the unfolding. A role does not step outside the whole and replace its course. We also do not know the next scene in advance.</w:t>
       </w:r>
     </w:p>
     <w:p>
       <w:r>
-        <w:t>“Energy” is spiritual and metaphysical language in this philosophy. It should not be presented as a measured physical quantity or as a scientific theory. The statement is meaningful as a worldview and contemplative orientation; it is not offered as experimentally verified cosmology.</w:t>
-      </w:r>
-    </w:p>
-    <w:p>
-      <w:pPr>
-        <w:pStyle w:val="Heading2"/>
-      </w:pPr>
-      <w:r>
-        <w:t>What remains possible within the design</w:t>
+        <w:t>For example, when a plan changes, feeling disappointment, examining alternatives, and making another plan occur within the game. The teaching concerns releasing the role’s claim to control the total design while experiencing its part fully. It does not remove action from experience.</w:t>
       </w:r>
     </w:p>
     <w:p>
       <w:r>
-        <w:t>The belief that the total design cannot be changed does not require passivity in ordinary life. Within time, people still learn, ask for help, prevent harm, apologize, repair relationships, seek treatment, change habits, build institutions, protect nature, and experience the consequences of choices. From the role-level perspective, these actions matter. Responsibility is part of the unfolding rather than an escape from it.</w:t>
+        <w:t>Reflection: recall a small scene you wanted to unfold differently. Remember the Creator who designed and entered the game. What is the difference between participating within this scene and demanding that the whole design be rewritten?</w:t>
+      </w:r>
+    </w:p>
+    <w:p>
+      <w:r>
+        <w:t>The names Brahman, Parabrahman, Ishwara, Paramatman, Allah, God, and Yahweh express Uday’s synthesis across religious vocabularies. Traditions differ in their meanings. “Energy” here is spiritual language, not a measured physical quantity.</w:t>
       </w:r>
     </w:p>
     <w:p>
@@ -370,7 +387,7 @@
     </w:p>
     <w:p>
       <w:r>
-        <w:t>Interpretive connection to the Mula Siddhanta: these passages support the contemplative claim that consciousness, the inner Self, the visible universe, and the ultimate reality are not finally separate. In Uday’s philosophy, this becomes the language of one Shakti: the source, the field of experiences, and the experiencer are understood within one ultimate reality. The role-level distinction remains essential: this interpretation does not erase pain, responsibility, ethical consequences, consent, or the need to prevent harm.</w:t>
+        <w:t>Interpretive connection to the Mula Siddhanta: these passages support the contemplative claim that consciousness, the inner Self, the visible universe, and the ultimate reality are not finally separate. In Uday’s philosophy, this becomes the language of one Shakti: the source, the field of experiences, and the experiencer are understood within one ultimate reality. The role-level distinction remains essential: this interpretation does not erase pain, ethical consequences, consent, or the need to prevent harm.</w:t>
       </w:r>
     </w:p>
     <w:p>
@@ -378,12 +395,12 @@
         <w:pStyle w:val="Heading1"/>
       </w:pPr>
       <w:r>
-        <w:t>3. Four paths to self-knowledge</w:t>
+        <w:t>3 Four paths to the same recognition</w:t>
       </w:r>
     </w:p>
     <w:p>
       <w:r>
-        <w:t>The central teaching is: “The solution to all problems is to know who we are. Bhakti, Jnana, Dhyana, and Karma can help us discover it.” The paths are different doorways suited to different temperaments. Their shared purpose is to loosen the separate ego and open into Self-knowledge, or Atma Sakshatkara.</w:t>
+        <w:t>Uday’s statement is: “The solution to all problems is to know who we are. Bhakti, Jnana, Dhyana, and Karma can help us discover it.” Here, the intended recognition is the Creator within the game whose design cannot be changed from inside. The four paths approach that recognition through different temperaments.</w:t>
       </w:r>
     </w:p>
     <w:p>
@@ -391,12 +408,12 @@
         <w:pStyle w:val="Heading2"/>
       </w:pPr>
       <w:r>
-        <w:t>Karma — the path of selfless duty</w:t>
+        <w:t>Karma</w:t>
       </w:r>
     </w:p>
     <w:p>
       <w:r>
-        <w:t>Perform necessary work without clinging to personal reward or recognition. Duty becomes an offering when it is carried out with care, discipline, and responsibility.</w:t>
+        <w:t>Action is experienced within the game. Working without making reward one’s identity loosens the role’s demand to dictate its next scene. Work becomes an occasion to remember the Creator and the shared creation.</w:t>
       </w:r>
     </w:p>
     <w:p>
@@ -404,12 +421,12 @@
         <w:pStyle w:val="Heading2"/>
       </w:pPr>
       <w:r>
-        <w:t>Bhakti — the path of surrender and devotion</w:t>
+        <w:t>Bhakti</w:t>
       </w:r>
     </w:p>
     <w:p>
       <w:r>
-        <w:t>Let go of the demand to control everything and trust the larger reality through love, reverence, prayer, and wholehearted surrender. Bhakti is not dependence on another person’s authority or the abandonment of judgment.</w:t>
+        <w:t>Devotion remembers God throughout the game, including in living people. Surrender releases the role’s demand to rewrite the whole for its own preferences. A sacred image may support this remembrance; Uday’s criticism concerns mechanical worship that forgets the divine in living relationships.</w:t>
       </w:r>
     </w:p>
     <w:p>
@@ -417,12 +434,12 @@
         <w:pStyle w:val="Heading2"/>
       </w:pPr>
       <w:r>
-        <w:t>Jnana — the path of self-enquiry</w:t>
+        <w:t>Jnana</w:t>
       </w:r>
     </w:p>
     <w:p>
       <w:r>
-        <w:t>Question “Who am I?” and examine what changes — body, thought, emotion, role, and story — against the awareness in which those experiences appear. Understanding is strengthened by honest questioning and discernment.</w:t>
+        <w:t>Enquiry asks who experiences the body, thought, feeling, and role. In this teaching, the question returns attention to the Creator who entered the game, rather than making a passing scene the whole of the Self.</w:t>
       </w:r>
     </w:p>
     <w:p>
@@ -430,17 +447,17 @@
         <w:pStyle w:val="Heading2"/>
       </w:pPr>
       <w:r>
-        <w:t>Dhyana / Raja — the path of meditation and mind-restraint</w:t>
+        <w:t>Dhyana and Raja</w:t>
       </w:r>
     </w:p>
     <w:p>
       <w:r>
-        <w:t>Steady the mind through attention, meditation, and practice. Notice thoughts and impulses without being ruled by every one of them. This is training in clarity, not suppression of feeling or withdrawal from ordinary responsibility.</w:t>
+        <w:t>Attention returns from changing thoughts to the central understanding. Quiet sitting is one occasion to remember the Creator within the already-designed game; the aim is to carry that remembrance into ordinary life.</w:t>
       </w:r>
     </w:p>
     <w:p>
       <w:r>
-        <w:t>The paths may overlap: action can become devotion, devotion can deepen enquiry, enquiry can steady meditation, and meditation can clarify action. No path grants permission to ignore consent, safety, evidence, or accountability.</w:t>
+        <w:t>Reflection: choose work, devotion, enquiry, or quiet attention. During it, recall the Creator who entered the fixed game for experiences. Which part of this understanding becomes clearer, and which part still raises a question?</w:t>
       </w:r>
     </w:p>
     <w:p>
@@ -448,17 +465,35 @@
         <w:pStyle w:val="Heading1"/>
       </w:pPr>
       <w:r>
-        <w:t>4. Sthitaprajna — steady wisdom</w:t>
+        <w:t>4 Sthitaprajna and steady remembrance</w:t>
       </w:r>
     </w:p>
     <w:p>
       <w:r>
-        <w:t>Sthitaprajna means a person of steady wisdom: one whose understanding remains stable in changing circumstances. The Sanskrit combines sthita, “steady or established,” with prajna, “wisdom, discernment, or clear understanding.”</w:t>
+        <w:t>Sthitaprajna means a person of steady wisdom. In the Bhagavad Gita’s Chapter 2, the description includes equanimity in pleasure and pain, inner contentment, sense mastery, and freedom from being governed by attachment, fear, and anger.</w:t>
       </w:r>
     </w:p>
     <w:p>
       <w:r>
-        <w:t>In the Bhagavad Gita, Arjuna asks Krishna about the marks of a person established in wisdom. In Chapter 2, Sankhya Yoga, the description points to an inner steadiness that is not dependent on success, comfort, praise, or control over events.</w:t>
+        <w:t>Uday connects this ideal to remembrance of the Creator amid changing scenes. The role cannot rewrite the game to retain only pleasant experiences. Steadiness concerns remaining aware of the deeper identity as success, disappointment, praise, and criticism unfold.</w:t>
+      </w:r>
+    </w:p>
+    <w:p>
+      <w:r>
+        <w:t>For example, praise at work may inflate a role, while criticism may collapse it. Returning to the same Creator in both scenes places the reactions within experience. This is an aspiration for practice, not an expectation that a person hide feelings or claim spiritual attainment.</w:t>
+      </w:r>
+    </w:p>
+    <w:p>
+      <w:r>
+        <w:t>Reflection: compare a pleasant and a difficult scene. What happened to remembrance of the Creator in each? How does the fixed-game teaching relate to meeting both experiences?</w:t>
+      </w:r>
+    </w:p>
+    <w:p>
+      <w:pPr>
+        <w:pStyle w:val="Heading1"/>
+      </w:pPr>
+      <w:r>
+        <w:t>5 Experiencing the game</w:t>
       </w:r>
     </w:p>
     <w:p>
@@ -466,7 +501,535 @@
         <w:pStyle w:val="Heading2"/>
       </w:pPr>
       <w:r>
-        <w:t>Characteristics of the Sthitaprajna</w:t>
+        <w:t>One Creator in different roles</w:t>
+      </w:r>
+    </w:p>
+    <w:p>
+      <w:r>
+        <w:t>The same Shakti appears as the person who praises, disagrees, succeeds, or makes a mistake. In Uday’s interpretation, hatred of an absolute “other” forgets that common source. He relates loss of felt connectedness to the inner meaning of Kali Yuga.</w:t>
+      </w:r>
+    </w:p>
+    <w:p>
+      <w:r>
+        <w:t>A colleague’s mistake can be addressed while remembering the Creator in both people. The error, frustration, and conversation all belong to the game. No one action contains the whole identity of either person.</w:t>
+      </w:r>
+    </w:p>
+    <w:p>
+      <w:pPr>
+        <w:pStyle w:val="Heading2"/>
+      </w:pPr>
+      <w:r>
+        <w:t>Witnessing and remembrance</w:t>
+      </w:r>
+    </w:p>
+    <w:p>
+      <w:r>
+        <w:t>Witnessing serves recognition: a feeling occurs within the Creator’s experience, rather than becoming the whole of who we are. An unanswered message may absorb the rejected role. Returning to the Creator within the fixed game questions that identification and the demand to dictate the next scene.</w:t>
+      </w:r>
+    </w:p>
+    <w:p>
+      <w:pPr>
+        <w:pStyle w:val="Heading2"/>
+      </w:pPr>
+      <w:r>
+        <w:t>The movie analogy</w:t>
+      </w:r>
+    </w:p>
+    <w:p>
+      <w:r>
+        <w:t>When we watch a movie, we may laugh, cry, become angry, and experience love. After leaving the theatre, remembering that it was a movie can change our relationship with those feelings. Uday uses this return of awareness to explain remembering the Creator while the game of life continues.</w:t>
+      </w:r>
+    </w:p>
+    <w:p>
+      <w:r>
+        <w:t>We created and entered this game for experiences; we cannot rewrite its design from inside. Remembering that is intended to loosen identification with a scene. The analogy does not say that pain or other people are unreal, or require every emotion to disappear immediately.</w:t>
+      </w:r>
+    </w:p>
+    <w:p>
+      <w:pPr>
+        <w:pStyle w:val="Heading2"/>
+      </w:pPr>
+      <w:r>
+        <w:t>The lotus practice</w:t>
+      </w:r>
+    </w:p>
+    <w:p>
+      <w:r>
+        <w:t>Picture a lotus in a pond, appearing to rest so lightly on the water that it is unclear whether the water touches it. This is Uday’s contemplative image for remaining within life, yet inwardly untouched by its passing scenes through remembrance of the Creator.</w:t>
+      </w:r>
+    </w:p>
+    <w:p>
+      <w:r>
+        <w:t>“Untouched” describes the intended spiritual state. The person can laugh, cry, love, and feel anger while returning to the Creator within the game. The purpose is neither emotional suppression nor withdrawal. The image is an analogy, not a literal botanical claim.</w:t>
+      </w:r>
+    </w:p>
+    <w:p>
+      <w:pPr>
+        <w:pStyle w:val="Heading2"/>
+      </w:pPr>
+      <w:r>
+        <w:t>Surrender within the game</w:t>
+      </w:r>
+    </w:p>
+    <w:p>
+      <w:r>
+        <w:t>Surrender follows the completed design: the role releases its demand to replace the whole game. Bhakti brings devotion to the Creator present throughout it; Jnana enquires into the identity behind the role. Both support participation with remembrance.</w:t>
+      </w:r>
+    </w:p>
+    <w:p>
+      <w:pPr>
+        <w:pStyle w:val="Heading2"/>
+      </w:pPr>
+      <w:r>
+        <w:t>Silence and intelligence</w:t>
+      </w:r>
+    </w:p>
+    <w:p>
+      <w:r>
+        <w:t>Uday describes intelligence becoming more available as the mind becomes quieter. Within the teaching, quietness can follow releasing the role’s demand to control the game. It does not guarantee that every intuition is correct or disclose the predetermined future.</w:t>
+      </w:r>
+    </w:p>
+    <w:p>
+      <w:r>
+        <w:t>If you feel certain someone is upset with you, recall the Creator in both lives and notice the demand to know the next scene. Asking a quiet question can take the place of assuming. Their answer, too, unfolds within the game.</w:t>
+      </w:r>
+    </w:p>
+    <w:p>
+      <w:r>
+        <w:t>Reflection: what conclusion is your role trying to force? Return to the Creator within the game whose design cannot be rewritten. What does that remembrance reveal about the feeling, and what still needs to be learned from the situation?</w:t>
+      </w:r>
+    </w:p>
+    <w:p>
+      <w:pPr>
+        <w:pStyle w:val="Heading1"/>
+      </w:pPr>
+      <w:r>
+        <w:t>6 Practices and everyday examples</w:t>
+      </w:r>
+    </w:p>
+    <w:p>
+      <w:r>
+        <w:t>Every exercise below uses the same central statement. None is a separate moral or productivity lesson. The sequence is remembrance, the scene and role, the demand for control, and participation within the game.</w:t>
+      </w:r>
+    </w:p>
+    <w:p>
+      <w:pPr>
+        <w:pStyle w:val="Heading2"/>
+      </w:pPr>
+      <w:r>
+        <w:t>The complete starting point</w:t>
+      </w:r>
+    </w:p>
+    <w:p>
+      <w:pPr>
+        <w:pStyle w:val="UdayQuote"/>
+      </w:pPr>
+      <w:r>
+        <w:t>We are the Creator. We created this game of experiences and entered it. Having designed it before entering, we cannot change its design from inside the game.</w:t>
+      </w:r>
+    </w:p>
+    <w:p>
+      <w:pPr>
+        <w:pStyle w:val="Heading2"/>
+      </w:pPr>
+      <w:r>
+        <w:t>Remember the whole teaching</w:t>
+      </w:r>
+    </w:p>
+    <w:p>
+      <w:r>
+        <w:t>Bring the central statement to mind: we are the Creator who made and entered this game for experiences; we cannot rewrite its design from inside. Let this frame the situation you are about to examine.</w:t>
+      </w:r>
+    </w:p>
+    <w:p>
+      <w:pPr>
+        <w:pStyle w:val="Heading2"/>
+      </w:pPr>
+      <w:r>
+        <w:t>Notice the scene and the role</w:t>
+      </w:r>
+    </w:p>
+    <w:p>
+      <w:r>
+        <w:t>Choose a small, ordinary event. What happened, what feeling arose, and which role feels caught in it? The experience is present; ask whether you have made that passing role your whole identity.</w:t>
+      </w:r>
+    </w:p>
+    <w:p>
+      <w:pPr>
+        <w:pStyle w:val="Heading2"/>
+      </w:pPr>
+      <w:r>
+        <w:t>Notice the demand to control the game</w:t>
+      </w:r>
+    </w:p>
+    <w:p>
+      <w:r>
+        <w:t>What are you insisting must happen next? In this teaching, we cannot stand outside the game to replace its design. You do not know the next scene; notice what happens when you acknowledge that.</w:t>
+      </w:r>
+    </w:p>
+    <w:p>
+      <w:pPr>
+        <w:pStyle w:val="Heading2"/>
+      </w:pPr>
+      <w:r>
+        <w:t>Participate from remembrance</w:t>
+      </w:r>
+    </w:p>
+    <w:p>
+      <w:r>
+        <w:t>Recall that the other person is also an expression of the same Creator. Let that recognition inform the response that is needed in this scene. Speaking, listening, resting, or repairing a mistake are themselves experiences within the game.</w:t>
+      </w:r>
+    </w:p>
+    <w:p>
+      <w:pPr>
+        <w:pStyle w:val="Heading2"/>
+      </w:pPr>
+      <w:r>
+        <w:t>Return and examine</w:t>
+      </w:r>
+    </w:p>
+    <w:p>
+      <w:r>
+        <w:t>Recall the whole statement again. Did identification with the role loosen? Did care arise more readily? Record what changed or did not change. The aim is understanding that carries into life; repeating the words alone does not establish it.</w:t>
+      </w:r>
+    </w:p>
+    <w:p>
+      <w:r>
+        <w:t>Reflection: In this scene I became caught in the role of ___. I wanted the game to unfold as ___. Remembering the Creator within the already-designed game meant ___ to me. What I actually noticed was ___.</w:t>
+      </w:r>
+    </w:p>
+    <w:p>
+      <w:r>
+        <w:t>Choose a small, ordinary event. Reflect privately and honestly. If a practice becomes overwhelming, stop and return to ordinary activity or suitable support.</w:t>
+      </w:r>
+    </w:p>
+    <w:p>
+      <w:pPr>
+        <w:pStyle w:val="Heading2"/>
+      </w:pPr>
+      <w:r>
+        <w:t>When thoughts keep circling</w:t>
+      </w:r>
+    </w:p>
+    <w:p>
+      <w:r>
+        <w:t>Within this philosophy, uncertainty is an experience in the game we entered. Remembering the Creator turns attention from demanding a particular next scene to noticing how the present one is being experienced.</w:t>
+      </w:r>
+    </w:p>
+    <w:p>
+      <w:r>
+        <w:t>Example: A message has no reply. You sent a message and no reply has arrived. The role of friend or partner feels rejected, and the mind keeps repeating, ‘They do not care about me.’</w:t>
+      </w:r>
+    </w:p>
+    <w:p>
+      <w:r>
+        <w:t>Remembering the Creator: Recall the Creator who entered the game for experiences. Waiting and the fear of rejection belong to this scene; they do not describe the whole of who you are. The other person shares the same source. You cannot rewrite the game to demand an immediate reply, and you do not yet know why they have not answered.</w:t>
+      </w:r>
+    </w:p>
+    <w:p>
+      <w:r>
+        <w:t>Participation within the game: A clear follow-up, or returning to the activity in front of you, can arise from this remembrance. Either is participation within the unfolding game. Notice whether your response expresses connection or an attempt to force the next scene.</w:t>
+      </w:r>
+    </w:p>
+    <w:p>
+      <w:r>
+        <w:t>Reflection: Which role feels rejected? What reply are you demanding from the game? Remember the shared Creator and the design you cannot rewrite from inside. What happens to the repeated story when you return to that understanding?</w:t>
+      </w:r>
+    </w:p>
+    <w:p>
+      <w:pPr>
+        <w:pStyle w:val="Heading2"/>
+      </w:pPr>
+      <w:r>
+        <w:t>When a conversation hurts</w:t>
+      </w:r>
+    </w:p>
+    <w:p>
+      <w:r>
+        <w:t>If the same Creator appears in both people, disagreement takes place between roles within one game. This is the teaching’s basis for care arising through recognition, rather than through a separate command to behave well.</w:t>
+      </w:r>
+    </w:p>
+    <w:p>
+      <w:r>
+        <w:t>Example: You are interrupted repeatedly. Someone interrupts you while you explain a concern. Anger appears and the role that wants respect begins to treat the other person as an enemy.</w:t>
+      </w:r>
+    </w:p>
+    <w:p>
+      <w:r>
+        <w:t>Remembering the Creator: Both lives express the same Creator in this philosophy. The anger is an experience within the game; it need not become your whole identity. Remember that you cannot rewrite the total design or dictate another person’s response from outside it.</w:t>
+      </w:r>
+    </w:p>
+    <w:p>
+      <w:r>
+        <w:t>Participation within the game: You might say, ‘I would like to finish, then I will listen.’ Pausing or leaving the conversation is also possible within the scene. Recognizing a shared source can inform a firm boundary; it does not erase the effects of the interruption or require staying where there is danger.</w:t>
+      </w:r>
+    </w:p>
+    <w:p>
+      <w:r>
+        <w:t>Reflection: Can you remember the Creator in both roles while feeling the anger? Which part of the next scene are you trying to dictate? From the understanding that your response also belongs to the game, what becomes clearer?</w:t>
+      </w:r>
+    </w:p>
+    <w:p>
+      <w:pPr>
+        <w:pStyle w:val="Heading2"/>
+      </w:pPr>
+      <w:r>
+        <w:t>When you judge yourself</w:t>
+      </w:r>
+    </w:p>
+    <w:p>
+      <w:r>
+        <w:t>The teaching locates identity in the Creator rather than in a successful or unsuccessful role. A mistake, the feeling about it, and learning afterwards are all experiences within the already-designed game.</w:t>
+      </w:r>
+    </w:p>
+    <w:p>
+      <w:r>
+        <w:t>Example: You forgot a commitment. You forgot to call when you said you would. Someone was inconvenienced. The thought changes from ‘I forgot’ to ‘I am a failure.’</w:t>
+      </w:r>
+    </w:p>
+    <w:p>
+      <w:r>
+        <w:t>Remembering the Creator: Return to the Creator who entered this game. The missed call belongs to a changing role; it is not the whole of your identity. You cannot replace the scene that occurred or rewrite the total design. Remorse, understanding, and repair can also unfold within it.</w:t>
+      </w:r>
+    </w:p>
+    <w:p>
+      <w:r>
+        <w:t>Participation within the game: Recognizing the same Creator in the person affected gives the apology its meaning. You may acknowledge the missed call and make a realistic arrangement. Let care for that connection guide the response, rather than treating punishment of yourself as the purpose of the scene.</w:t>
+      </w:r>
+    </w:p>
+    <w:p>
+      <w:r>
+        <w:t>Reflection: What label has the role taken on? Remember the Creator within the game whose design cannot be rewritten. Does that remembrance change how you meet the person affected, without denying what happened?</w:t>
+      </w:r>
+    </w:p>
+    <w:p>
+      <w:pPr>
+        <w:pStyle w:val="Heading2"/>
+      </w:pPr>
+      <w:r>
+        <w:t>When a decision feels difficult</w:t>
+      </w:r>
+    </w:p>
+    <w:p>
+      <w:r>
+        <w:t>A fixed design does not remove decisions from experience. In this philosophy, weighing possibilities, deciding, and discovering the result are themselves parts of the game the Creator entered.</w:t>
+      </w:r>
+    </w:p>
+    <w:p>
+      <w:r>
+        <w:t>Example: Should you accept another commitment?. You are invited to help organize an event, but your week is full. You want to be useful and also want everyone to approve of you.</w:t>
+      </w:r>
+    </w:p>
+    <w:p>
+      <w:r>
+        <w:t>Remembering the Creator: Notice the role seeking approval, then recall the Creator within the already-designed game. You cannot rewrite the whole to guarantee praise or a perfect result. You can examine the time available and what the invitation involves as part of your participation in this scene.</w:t>
+      </w:r>
+    </w:p>
+    <w:p>
+      <w:r>
+        <w:t>Participation within the game: An honest offer of one hour, or a clear decline, may follow. The same Creator is present in the people involved, so their time and your existing commitments matter within the experience. The outcome unfolds; the decision does not put you outside the game.</w:t>
+      </w:r>
+    </w:p>
+    <w:p>
+      <w:r>
+        <w:t>Reflection: What outcome would you like to guarantee? Remember that the Creator is experiencing a decision inside a game whose design cannot be rewritten. What choice becomes clearer when approval no longer defines your identity?</w:t>
+      </w:r>
+    </w:p>
+    <w:p>
+      <w:pPr>
+        <w:pStyle w:val="Heading2"/>
+      </w:pPr>
+      <w:r>
+        <w:t>When possessions overshadow people</w:t>
+      </w:r>
+    </w:p>
+    <w:p>
+      <w:r>
+        <w:t>In Uday’s teaching, gold, diamonds, and money are small parts of the creation we entered. The Creator’s identity is not measured by possessing them. This is the proposed reason that relationships can regain importance as understanding deepens.</w:t>
+      </w:r>
+    </w:p>
+    <w:p>
+      <w:r>
+        <w:t>Example: An object becomes more important than a relationship. Someone close to you accidentally damages something valuable. Worry about its cost quickly becomes contempt for the person.</w:t>
+      </w:r>
+    </w:p>
+    <w:p>
+      <w:r>
+        <w:t>Remembering the Creator: The object is one small part of creation; the other person is another expression of the same Creator. You cannot rewrite the game to undo this scene. The cost can still be addressed, but neither the object nor the loss contains your whole identity.</w:t>
+      </w:r>
+    </w:p>
+    <w:p>
+      <w:r>
+        <w:t>Participation within the game: From that remembrance, a conversation about what happened and possible repair can unfold without reducing the relationship to the price of an object. Practical needs remain part of the game; this exercise is about attachment, not ignoring bills or giving away possessions.</w:t>
+      </w:r>
+    </w:p>
+    <w:p>
+      <w:r>
+        <w:t>Reflection: What has the object come to represent about your role or status? Remember the shared Creator within the fixed game. What changes when you consider the relationship alongside the loss?</w:t>
+      </w:r>
+    </w:p>
+    <w:p>
+      <w:pPr>
+        <w:pStyle w:val="Heading2"/>
+      </w:pPr>
+      <w:r>
+        <w:t>The movie and the lotus</w:t>
+      </w:r>
+    </w:p>
+    <w:p>
+      <w:r>
+        <w:t>The movie analogy illustrates absorption and remembrance. The lotus image expresses the intended state of participation: within the pond of life, with such light attachment that it seems unclear whether its water touches you. Both point back to the Creator within the game.</w:t>
+      </w:r>
+    </w:p>
+    <w:p>
+      <w:r>
+        <w:t>Example: Remembering after an emotional scene. In a movie theatre, a scene can bring laughter, tears, anger, or love. On leaving, remembering that it was a movie can change your relationship with those feelings. Think of a small event in your day that similarly absorbed you.</w:t>
+      </w:r>
+    </w:p>
+    <w:p>
+      <w:r>
+        <w:t>Remembering the Creator: Uday applies that movement of remembrance to the game of experiences: we are the Creator who designed and entered it, and cannot rewrite the design from within. Return to that understanding while life continues. The lotus describes remaining in the experience without making each passing emotion your deepest identity.</w:t>
+      </w:r>
+    </w:p>
+    <w:p>
+      <w:r>
+        <w:t>Participation within the game: Feel what is present and notice whether remembering the teaching changes your attachment to it. There is no required deadline for an emotion to leave. Remembrance means remaining engaged with life; it is not a demand to become numb or treat other people’s experiences as unreal.</w:t>
+      </w:r>
+    </w:p>
+    <w:p>
+      <w:r>
+        <w:t>Reflection: Which scene absorbed you? What does remembering the Creator and the game’s fixed design mean here? Can you allow the emotion while exploring the lotus image of being inwardly untouched? Describe what actually happens.</w:t>
+      </w:r>
+    </w:p>
+    <w:p>
+      <w:pPr>
+        <w:pStyle w:val="Heading2"/>
+      </w:pPr>
+      <w:r>
+        <w:t>An evening return</w:t>
+      </w:r>
+    </w:p>
+    <w:p>
+      <w:r>
+        <w:t>Recall the complete teaching at the end of the day. Which scene absorbed you into a passing role? Where did you demand a different unfolding? Did remembering the same Creator in another person change the relationship? Record what changed and what did not. Remembrance itself is within the game, not a means of rewriting it.</w:t>
+      </w:r>
+    </w:p>
+    <w:p>
+      <w:pPr>
+        <w:pStyle w:val="Heading1"/>
+      </w:pPr>
+      <w:r>
+        <w:t>7 Intended effects and honest enquiry</w:t>
+      </w:r>
+    </w:p>
+    <w:p>
+      <w:r>
+        <w:t>Within Uday’s teaching, care, steadiness, and a quieter mind follow from knowing who we are. Responsibility is understood as a natural expression of recognizing the shared Creator. Educational content should explain that connection instead of repeatedly telling readers to be responsible.</w:t>
+      </w:r>
+    </w:p>
+    <w:p>
+      <w:r>
+        <w:t>The intended movement can be explored in relationships and ordinary decisions. Ask what the central statement meant in the scene, whether identification with the role loosened, and how the person actually responded. Repeating the statement is not a measure of realization, and a reader can report no change or disagreement.</w:t>
+      </w:r>
+    </w:p>
+    <w:p>
+      <w:r>
+        <w:t>A lesson cannot guarantee that everyone becomes good, successful, wealthy, healthy, or free from distress. A personal observation does not prove the cosmology. Children and adults alike retain worth regardless of performance or their response to a practice.</w:t>
+      </w:r>
+    </w:p>
+    <w:p>
+      <w:r>
+        <w:t>The shared-creation perspective includes the person who is hurt. Consent, protection, boundaries, apology, and appropriate help remain meaningful within the game. They do not need to become competing teaching themes, but they should not be erased by the language of oneness.</w:t>
+      </w:r>
+    </w:p>
+    <w:p>
+      <w:r>
+        <w:t>Spiritual reflection does not replace medical, psychological, or emergency care. No claim of cures, immunity changes, or prevention of suicide is established by this philosophy.</w:t>
+      </w:r>
+    </w:p>
+    <w:p>
+      <w:pPr>
+        <w:pStyle w:val="Heading1"/>
+      </w:pPr>
+      <w:r>
+        <w:t>8 The Beautiful World vision</w:t>
+      </w:r>
+    </w:p>
+    <w:p>
+      <w:pPr>
+        <w:pStyle w:val="UdayQuote"/>
+      </w:pPr>
+      <w:r>
+        <w:t>“My main goal is to make this world a beautiful place to live in, so that in that beautiful place I can live happily.”</w:t>
+      </w:r>
+    </w:p>
+    <w:p>
+      <w:r>
+        <w:t>The intended route begins with recognition of the Creator in the shared creation. From that understanding, Uday expects concern for relationships, people, and nature to arise naturally. The world we experience belongs to the same source we call ourselves.</w:t>
+      </w:r>
+    </w:p>
+    <w:p>
+      <w:r>
+        <w:t>Gold, diamonds, money, and status are small parts of creation in his explanation. They cannot enlarge the Creator’s identity. This is the proposed connection between less attachment to possessions and greater regard for relationships. Practical needs remain part of life.</w:t>
+      </w:r>
+    </w:p>
+    <w:p>
+      <w:r>
+        <w:t>Helping someone learn, restoring a shared space, and addressing harm are activities within the unfolding game. The aspiration toward a beautiful world does not require an individual to stand outside the whole and rewrite its design.</w:t>
+      </w:r>
+    </w:p>
+    <w:p>
+      <w:pPr>
+        <w:pStyle w:val="Heading2"/>
+      </w:pPr>
+      <w:r>
+        <w:t>Technology in the service of experience</w:t>
+      </w:r>
+    </w:p>
+    <w:p>
+      <w:r>
+        <w:t>AI and robots feature in the long-term vision as ways to reduce survival burdens through farming, production, healthcare, logistics, and maintenance. Their proposed purpose is to make room for awareness, creativity, relationship, exploration, and joy within the Creator’s experience.</w:t>
+      </w:r>
+    </w:p>
+    <w:p>
+      <w:r>
+        <w:t>Protected forests, less intrusive infrastructure, and AI-equipped mobile homes are aspirations to investigate. They follow the concern for shared creation, but are not existing programmes or inevitable consequences of realization. Feasibility, ecological effects, fairness, governance, and access require practical investigation.</w:t>
+      </w:r>
+    </w:p>
+    <w:p>
+      <w:r>
+        <w:t>Reflection: consider a place shared with other lives. What care becomes meaningful when you remember the same Creator in that creation? How does that care belong to participation within the already-designed game?</w:t>
+      </w:r>
+    </w:p>
+    <w:p>
+      <w:pPr>
+        <w:pStyle w:val="Heading1"/>
+      </w:pPr>
+      <w:r>
+        <w:t>9 Teaching through the website</w:t>
+      </w:r>
+    </w:p>
+    <w:p>
+      <w:r>
+        <w:t>The website itself should help visitors understand and explore the complete teaching without Uday’s personal help. The homepage states the Creator, creation for experiences, entry, and the inability to rewrite the design from inside before offering an exercise.</w:t>
+      </w:r>
+    </w:p>
+    <w:p>
+      <w:r>
+        <w:t>The Philosophy page develops that root through roles, witnessing, the movie and lotus, the four paths, steady wisdom, relationships, possessions, intelligence, scriptural connections, and the Beautiful World vision. Each explanation and reflection shows its relationship to the same foundation.</w:t>
+      </w:r>
+    </w:p>
+    <w:p>
+      <w:r>
+        <w:t>Daily Practice uses the shared sequence and six worked examples. Each includes the scene, remembrance of the Creator, participation within the game, and a reflection that returns to the teaching. The Questions page addresses the same understanding and its implications.</w:t>
+      </w:r>
+    </w:p>
+    <w:p>
+      <w:pPr>
+        <w:pStyle w:val="Heading2"/>
+      </w:pPr>
+      <w:r>
+        <w:t>Content acceptance test</w:t>
       </w:r>
     </w:p>
     <w:p>
@@ -474,7 +1037,7 @@
         <w:pStyle w:val="ListBullet"/>
       </w:pPr>
       <w:r>
-        <w:t>Equanimity in pleasure and pain: does not collapse in sorrow or become inflated by happiness; remains even-minded.</w:t>
+        <w:t>Can the reader identify the complete governing statement before beginning the exercise?</w:t>
       </w:r>
     </w:p>
     <w:p>
@@ -482,7 +1045,7 @@
         <w:pStyle w:val="ListBullet"/>
       </w:pPr>
       <w:r>
-        <w:t>Freedom from reactive disturbances: does not become governed by excessive attachment, fear, or anger — “vitaraga-bhaya-krodhah.”</w:t>
+        <w:t>Does the explanation show how this particular scene relates to the Creator within the fixed design?</w:t>
       </w:r>
     </w:p>
     <w:p>
@@ -490,7 +1053,7 @@
         <w:pStyle w:val="ListBullet"/>
       </w:pPr>
       <w:r>
-        <w:t>Sense mastery: like a tortoise withdrawing its limbs, can gather the senses inward instead of being dragged by every stimulus or impulse.</w:t>
+        <w:t>Does the example distinguish the passing role from the shared identity, without pretending the scene has no consequences?</w:t>
       </w:r>
     </w:p>
     <w:p>
@@ -498,17 +1061,33 @@
         <w:pStyle w:val="ListBullet"/>
       </w:pPr>
       <w:r>
-        <w:t>Inner contentment: finds a source of fulfilment within the Self rather than depending entirely on external objects or circumstances.</w:t>
+        <w:t>Does the reflection return to the teaching and allow the reader to describe what actually happened?</w:t>
+      </w:r>
+    </w:p>
+    <w:p>
+      <w:pPr>
+        <w:pStyle w:val="ListBullet"/>
+      </w:pPr>
+      <w:r>
+        <w:t>Is care explained as arising through recognition, rather than inserted as an unrelated instruction?</w:t>
       </w:r>
     </w:p>
     <w:p>
       <w:r>
-        <w:t>In practical terms, the Sthitaprajna is not emotionally numb or indifferent. Steady wisdom means feeling what is present without losing discernment, responsibility, or compassion. Success and failure, difficulty and gain, praise and criticism may still be experienced, but they do not completely displace clarity.</w:t>
+        <w:t>The website retains calm, readable pages, in-page contents, and independent access. No payment, registration, or personal disclosure is required for learning. Optional conversation, contact, and privacy information support access and remain factual operational content.</w:t>
+      </w:r>
+    </w:p>
+    <w:p>
+      <w:pPr>
+        <w:pStyle w:val="Heading2"/>
+      </w:pPr>
+      <w:r>
+        <w:t>Earlier programme proposals</w:t>
       </w:r>
     </w:p>
     <w:p>
       <w:r>
-        <w:t>This ideal connects the four paths: selfless action reduces attachment to outcomes; devotion softens the demand for control; self-enquiry reveals what remains steady; and meditation trains attention and sense-restraint. It is an aspiration for practice, not a label to claim prematurely.</w:t>
+        <w:t>The earlier guide proposed a small 30-day adult learning circle. It remains a proposal, not a launched programme. If developed, every session and short lesson should now use the complete central statement, a connected experience, and reflection on remembrance. Participation and reports of usefulness do not prove the philosophy.</w:t>
       </w:r>
     </w:p>
     <w:p>
@@ -516,7 +1095,22 @@
         <w:pStyle w:val="Heading1"/>
       </w:pPr>
       <w:r>
-        <w:t>5. The structure of experience</w:t>
+        <w:t>10 Future videos and communication</w:t>
+      </w:r>
+    </w:p>
+    <w:p>
+      <w:r>
+        <w:t>Future YouTube videos, scripts, lessons, and translations should use the same teaching structure as the website. Begin with the relevant part of the root understanding, develop it through a recognizable scene, and return to it in the closing reflection.</w:t>
+      </w:r>
+    </w:p>
+    <w:p>
+      <w:r>
+        <w:t>A video about anger, for example, would examine the role absorbed in a disagreement, recall the shared Creator in both people, explain the inability to dictate the next scene of the game, and explore participation from remembrance. Its purpose is to clarify this understanding rather than provide disconnected anger-management advice.</w:t>
+      </w:r>
+    </w:p>
+    <w:p>
+      <w:r>
+        <w:t>For a short clip, link its specific focus to the full statement and provide a route to the complete explanation. Do not imply that a short affirmation proves understanding or guarantees an outcome.</w:t>
       </w:r>
     </w:p>
     <w:p>
@@ -524,90 +1118,17 @@
         <w:pStyle w:val="Heading2"/>
       </w:pPr>
       <w:r>
-        <w:t>One Shakti / one source</w:t>
+        <w:t>Reusable content brief</w:t>
       </w:r>
     </w:p>
     <w:p>
       <w:r>
-        <w:t>Existence is understood as one Shakti appearing through many beings and roles. The same source is present in the person who is joyful, confused, successful, afraid, helpful, or harmful. This supports humility and compassion, but it does not erase differences in conduct, consent, accountability, or safety.</w:t>
-      </w:r>
-    </w:p>
-    <w:p>
-      <w:pPr>
-        <w:pStyle w:val="Heading2"/>
-      </w:pPr>
-      <w:r>
-        <w:t>Two levels: Shakti and role</w:t>
+        <w:t>Create a lesson from this scene within Uday’s philosophy: we are the Creator who designed and entered the game for experiences, and cannot change its design from inside. Explain the role, emotion, and demand for control. Connect remembrance to participation and relationships. End with a reflection that examines the same understanding and permits an honest response.</w:t>
       </w:r>
     </w:p>
     <w:p>
       <w:r>
-        <w:t>At the Shakti level, there is completeness, non-separation, and a recognition that life is one movement. At the role level, pain is real, responsibilities are real, moral distinctions are real, and actions have consequences. Good communication must hold both levels together. Non-separation must never be used to excuse abuse, silence a person in pain, or remove the need for boundaries.</w:t>
-      </w:r>
-    </w:p>
-    <w:p>
-      <w:pPr>
-        <w:pStyle w:val="Heading2"/>
-      </w:pPr>
-      <w:r>
-        <w:t>Witnessing</w:t>
-      </w:r>
-    </w:p>
-    <w:p>
-      <w:r>
-        <w:t>Awakening, in practical terms, is the capacity to notice thoughts, emotions, sensations, and reactions without being completely captured by them. When resistance decreases, the experience of a situation may change even while ordinary responsibilities continue. Witnessing is therefore a practice of clearer participation, not withdrawal from life.</w:t>
-      </w:r>
-    </w:p>
-    <w:p>
-      <w:pPr>
-        <w:pStyle w:val="Heading2"/>
-      </w:pPr>
-      <w:r>
-        <w:t>Surrender and the meeting of Bhakti and Jnana</w:t>
-      </w:r>
-    </w:p>
-    <w:p>
-      <w:r>
-        <w:t>Surrender points toward trusting the larger unfolding; Jnana points toward seeing clearly; Bhakti points toward devotion and love. In this philosophy they converge in a practical movement: see Shakti in every person, meet reality as it is, and respond appropriately to what is happening. Surrender is not resignation, carelessness, or obedience to another person’s demands.</w:t>
-      </w:r>
-    </w:p>
-    <w:p>
-      <w:pPr>
-        <w:pStyle w:val="Heading2"/>
-      </w:pPr>
-      <w:r>
-        <w:t>No hatred, only connectedness</w:t>
-      </w:r>
-    </w:p>
-    <w:p>
-      <w:r>
-        <w:t>“Do not hate anyone, because to hate another person is to hate yourself. There is no separate ‘other’ outside; everything is connected.” In this perspective, the loss of felt connection is the inner meaning of Kali Yuga. The teaching is an invitation to drop dehumanizing hatred, not a demand to tolerate harm. Boundaries, protection, consequences, and leaving an unsafe situation remain valid expressions of care.</w:t>
-      </w:r>
-    </w:p>
-    <w:p>
-      <w:pPr>
-        <w:pStyle w:val="Heading2"/>
-      </w:pPr>
-      <w:r>
-        <w:t>The lotus and the sportive spirit</w:t>
-      </w:r>
-    </w:p>
-    <w:p>
-      <w:r>
-        <w:t>Play the game of life with a sportive spirit. We are the creators who created this game and entered it. Like a lotus in a pond, whose relationship with the water is so light that we cannot easily say whether the water is touching it or not, remain within life without being inwardly touched by every experience. Laugh, cry, become angry, love, and experience everything fully, while remembering that these emotions belong to the game. When creator-awareness returns, the emotion no longer rules or clings to us. This is not suppression or indifference. A creator does not create needless hatred, cruelty, or confusion; when creator-awareness is clear, care for the world arises naturally rather than through repeated commands.</w:t>
-      </w:r>
-    </w:p>
-    <w:p>
-      <w:pPr>
-        <w:pStyle w:val="Heading2"/>
-      </w:pPr>
-      <w:r>
-        <w:t>Intelligence and intuition</w:t>
-      </w:r>
-    </w:p>
-    <w:p>
-      <w:r>
-        <w:t>The philosophy describes intelligence as becoming more available when resistance drops and the body-mind is less entangled. Intuition may feel clearer when attention is calm and spacious. These are spiritual descriptions of experience, not proof of a universal intelligence field. Intuition should be checked against evidence, consequences, lived experience, and other perspectives.</w:t>
+        <w:t>Ideas may be captured on a phone or developed on a computer. Preserve Uday’s original words separately from editorial explanations. Obtain consent before using personal stories, and check public translations for fidelity. No videos or publishing schedule are created simply by recording this guidance.</w:t>
       </w:r>
     </w:p>
     <w:p>
@@ -615,94 +1136,27 @@
         <w:pStyle w:val="Heading1"/>
       </w:pPr>
       <w:r>
-        <w:t>6. Core practices and human relationships</w:t>
-      </w:r>
-    </w:p>
-    <w:p>
-      <w:pPr>
-        <w:pStyle w:val="Heading2"/>
-      </w:pPr>
-      <w:r>
-        <w:t>Seeing the person and the action</w:t>
+        <w:t>11 Project continuity</w:t>
       </w:r>
     </w:p>
     <w:p>
       <w:r>
-        <w:t>A person can be recognized as an expression of the same source while an action is still named as harmful or unacceptable. Compassion means responding without hatred where possible; it does not mean removing protection, accountability, consequences, or the right to leave an unsafe situation.</w:t>
-      </w:r>
-    </w:p>
-    <w:p>
-      <w:pPr>
-        <w:pStyle w:val="Heading2"/>
-      </w:pPr>
-      <w:r>
-        <w:t>A practical response sequence</w:t>
-      </w:r>
-    </w:p>
-    <w:p>
-      <w:pPr>
-        <w:pStyle w:val="ListBullet"/>
-      </w:pPr>
-      <w:r>
-        <w:t>Pause and notice the inner reaction.</w:t>
-      </w:r>
-    </w:p>
-    <w:p>
-      <w:pPr>
-        <w:pStyle w:val="ListBullet"/>
-      </w:pPr>
-      <w:r>
-        <w:t>Recognize the humanity of the people involved without denying the facts.</w:t>
-      </w:r>
-    </w:p>
-    <w:p>
-      <w:pPr>
-        <w:pStyle w:val="ListBullet"/>
-      </w:pPr>
-      <w:r>
-        <w:t>Name the need, harm, boundary, or responsibility at the role level.</w:t>
-      </w:r>
-    </w:p>
-    <w:p>
-      <w:pPr>
-        <w:pStyle w:val="ListBullet"/>
-      </w:pPr>
-      <w:r>
-        <w:t>Choose the response that reduces avoidable harm and supports repair where possible.</w:t>
-      </w:r>
-    </w:p>
-    <w:p>
-      <w:pPr>
-        <w:pStyle w:val="ListBullet"/>
-      </w:pPr>
-      <w:r>
-        <w:t>Review what happened and learn without repetitive self-condemnation.</w:t>
-      </w:r>
-    </w:p>
-    <w:p>
-      <w:pPr>
-        <w:pStyle w:val="Heading2"/>
-      </w:pPr>
-      <w:r>
-        <w:t>Guilt, remorse, and repair</w:t>
+        <w:t>This reference and README record the current teaching direction. They supersede earlier proposals that organized lessons around generic responsibility or self-improvement. The retained Beautiful World guide remains an unchanged historical source.</w:t>
       </w:r>
     </w:p>
     <w:p>
       <w:r>
-        <w:t>The philosophy aims to reduce unproductive guilt and hostility, not to erase remorse. A responsible response can include acknowledging harm, apologizing, making repair, accepting consequences, changing behaviour, and maintaining boundaries. Inner freedom and ethical responsibility belong together.</w:t>
-      </w:r>
-    </w:p>
-    <w:p>
-      <w:pPr>
-        <w:pStyle w:val="Heading2"/>
-      </w:pPr>
-      <w:r>
-        <w:t>Children, young people, and vulnerable people</w:t>
+        <w:t>The current website and this document share the central statement, five practice steps, and six example texts through teaching-content.json. This reduces drift between the public teaching and its reference. Future changes should update those shared passages and regenerate the document and website.</w:t>
       </w:r>
     </w:p>
     <w:p>
       <w:r>
-        <w:t>Academic results, social status, or productivity do not determine a person’s worth. Children and young people should be encouraged to ask for help and receive appropriate support. Spiritual language must never replace safeguarding, professional care, emergency help, or direct intervention when someone is at risk.</w:t>
+        <w:t>The original Mula Siddhanta and all ten scriptural pointers must remain available. Explain the relationship between the pointers and Uday’s interpretation without claiming each independently proves the designed game.</w:t>
+      </w:r>
+    </w:p>
+    <w:p>
+      <w:r>
+        <w:t>AI can help organize and clarify this content, check consistency, build pages, and prepare future material. Its involvement does not establish the worldview or guarantee realization. New programmes, external messages, or media publication need their own requested scope.</w:t>
       </w:r>
     </w:p>
     <w:p>
@@ -710,180 +1164,7 @@
         <w:pStyle w:val="Heading1"/>
       </w:pPr>
       <w:r>
-        <w:t>7. Intended effects and responsible boundaries</w:t>
-      </w:r>
-    </w:p>
-    <w:p>
-      <w:r>
-        <w:t>The following are intended or possible effects of practising this perspective, not guaranteed outcomes: less repetitive self-condemnation; greater calm during difficulty; more room for reflection; steadier choices at work and with money; more compassionate relationships; and a less rigid identification with success and failure.</w:t>
-      </w:r>
-    </w:p>
-    <w:p>
-      <w:r>
-        <w:t>These possibilities must be communicated modestly. A practice may help one person and not another. Mindfulness or reflective practices may support stress management or sleep for some people, but Mind Clarity should not promise cures, immunity, hormone changes, prevention of suicide, guaranteed financial success, or guaranteed freedom from anxiety. Health questions belong with qualified professionals and evidence-based care.</w:t>
-      </w:r>
-    </w:p>
-    <w:p>
-      <w:r>
-        <w:t>A useful test is practical rather than metaphysical: do willing adults notice their reactions more clearly, recognize shared humanity, and choose a more responsible response? Positive change can be valuable without being treated as proof of the whole cosmology.</w:t>
-      </w:r>
-    </w:p>
-    <w:p>
-      <w:pPr>
-        <w:pStyle w:val="Heading1"/>
-      </w:pPr>
-      <w:r>
-        <w:t>8. The Beautiful World vision</w:t>
-      </w:r>
-    </w:p>
-    <w:p>
-      <w:pPr>
-        <w:pStyle w:val="Heading2"/>
-      </w:pPr>
-      <w:r>
-        <w:t>Purpose and mission</w:t>
-      </w:r>
-    </w:p>
-    <w:p>
-      <w:r>
-        <w:t>The purpose is to help make the world a beautiful place to live in, so that people can live happily. A working mission is to help people live with greater clarity, kindness, and responsibility; protect nature; and explore technology that reduces everyday burdens so people have more time for awareness, creativity, relationships, and joyful living.</w:t>
-      </w:r>
-    </w:p>
-    <w:p>
-      <w:pPr>
-        <w:pStyle w:val="Heading2"/>
-      </w:pPr>
-      <w:r>
-        <w:t>Nature and material conditions</w:t>
-      </w:r>
-    </w:p>
-    <w:p>
-      <w:r>
-        <w:t>A beautiful world is not only a change in thoughts. It includes clean surroundings, protected forests and ecosystems, accessible learning, useful support, respectful conversation, and systems that reduce avoidable suffering. Inner clarity and material conditions should be considered together.</w:t>
-      </w:r>
-    </w:p>
-    <w:p>
-      <w:pPr>
-        <w:pStyle w:val="Heading2"/>
-      </w:pPr>
-      <w:r>
-        <w:t>Technology, AI, and robotics</w:t>
-      </w:r>
-    </w:p>
-    <w:p>
-      <w:r>
-        <w:t>The long-term picture includes AI and robots assisting with production, farming, healthcare, logistics, maintenance, and other necessary work. The purpose is not technology for its own sake. The purpose is to reduce survival burdens and free time for creativity, exploration, awareness, care, and joyful living. A possible future includes clean living, limited infrastructure, and AI-equipped mobile homes that support worry-free travel, but feasibility, ecological impact, fairness, access, governance, and unintended consequences require serious investigation.</w:t>
-      </w:r>
-    </w:p>
-    <w:p>
-      <w:pPr>
-        <w:pStyle w:val="Heading2"/>
-      </w:pPr>
-      <w:r>
-        <w:t>Starting small</w:t>
-      </w:r>
-    </w:p>
-    <w:p>
-      <w:r>
-        <w:t>The recommended beginning is modest: a small circle of willing people, one clearer response to an everyday difficulty, a simple public teaching, an inner practice paired with a visible act of care, and a way to preserve happiness during the journey. The work should grow from evidence of usefulness rather than from pressure or grand claims.</w:t>
-      </w:r>
-    </w:p>
-    <w:p>
-      <w:pPr>
-        <w:pStyle w:val="Heading1"/>
-      </w:pPr>
-      <w:r>
-        <w:t>9. Mind Clarity as practice and teaching</w:t>
-      </w:r>
-    </w:p>
-    <w:p>
-      <w:pPr>
-        <w:pStyle w:val="Heading2"/>
-      </w:pPr>
-      <w:r>
-        <w:t>A simple learning movement</w:t>
-      </w:r>
-    </w:p>
-    <w:p>
-      <w:pPr>
-        <w:pStyle w:val="ListBullet"/>
-      </w:pPr>
-      <w:r>
-        <w:t>Examine direct experience: what is happening in the body, mind, and situation?</w:t>
-      </w:r>
-    </w:p>
-    <w:p>
-      <w:pPr>
-        <w:pStyle w:val="ListBullet"/>
-      </w:pPr>
-      <w:r>
-        <w:t>Notice resistance, identification, and the stories added to events.</w:t>
-      </w:r>
-    </w:p>
-    <w:p>
-      <w:pPr>
-        <w:pStyle w:val="ListBullet"/>
-      </w:pPr>
-      <w:r>
-        <w:t>Allow spiritual and non-spiritual interpretations to coexist respectfully.</w:t>
-      </w:r>
-    </w:p>
-    <w:p>
-      <w:pPr>
-        <w:pStyle w:val="ListBullet"/>
-      </w:pPr>
-      <w:r>
-        <w:t>Separate shared humanity from agreement about beliefs.</w:t>
-      </w:r>
-    </w:p>
-    <w:p>
-      <w:pPr>
-        <w:pStyle w:val="ListBullet"/>
-      </w:pPr>
-      <w:r>
-        <w:t>Translate insight into a responsible action or a kinder conversation.</w:t>
-      </w:r>
-    </w:p>
-    <w:p>
-      <w:pPr>
-        <w:pStyle w:val="ListBullet"/>
-      </w:pPr>
-      <w:r>
-        <w:t>Review what changed without claiming that one experience proves a universal truth.</w:t>
-      </w:r>
-    </w:p>
-    <w:p>
-      <w:pPr>
-        <w:pStyle w:val="Heading2"/>
-      </w:pPr>
-      <w:r>
-        <w:t>A possible 30-day experiment</w:t>
-      </w:r>
-    </w:p>
-    <w:p>
-      <w:r>
-        <w:t>A proposed pilot could involve 5–8 willing adults. Week one listens and prepares. Week two holds one 45-minute circle: purpose and permission to pass; personal examples; noticing reactions; respectful responses; and one chosen action. Week three offers three short lessons. Week four follows up and reviews. Permission should be obtained before recording or sharing anything. Measures can include attendance, actions taken, quality of conversations, return participation, time, enjoyment, and energy. This is a learning experiment, not clinical proof.</w:t>
-      </w:r>
-    </w:p>
-    <w:p>
-      <w:pPr>
-        <w:pStyle w:val="Heading2"/>
-      </w:pPr>
-      <w:r>
-        <w:t>Current website relationship</w:t>
-      </w:r>
-    </w:p>
-    <w:p>
-      <w:r>
-        <w:t>The Mind Clarity website is itself a place of learning and enquiry, not primarily a doorway to Uday’s services. Its purpose is to support understanding and the aspiration toward enlightenment through the website itself. Visitors should be able to read the full philosophy, examine an everyday difficulty, practise independently, and choose a responsible next step without Uday’s personal help. This describes the purpose of the experience, not a guaranteed spiritual outcome.</w:t>
-      </w:r>
-    </w:p>
-    <w:p>
-      <w:pPr>
-        <w:pStyle w:val="Heading2"/>
-      </w:pPr>
-      <w:r>
-        <w:t>Governing website principle — 18 September 2026</w:t>
+        <w:t>12 Summary and version record</w:t>
       </w:r>
     </w:p>
     <w:p>
@@ -891,282 +1172,17 @@
         <w:pStyle w:val="UdayQuote"/>
       </w:pPr>
       <w:r>
-        <w:t>“The website should enlighten them with the website itself without my help. That should be the design language of the website.”</w:t>
-      </w:r>
-    </w:p>
-    <w:p>
-      <w:pPr>
-        <w:pStyle w:val="SmallNote"/>
-      </w:pPr>
-      <w:r>
-        <w:rPr>
-          <w:b/>
-        </w:rPr>
-        <w:t>UDAY’S CURRENT DIRECTION; TAKES PRECEDENCE OVER EARLIER CONSULTATION-LED WEBSITE PLANS</w:t>
-      </w:r>
-    </w:p>
-    <w:p>
-      <w:pPr>
-        <w:pStyle w:val="ListBullet"/>
-      </w:pPr>
-      <w:r>
-        <w:t>Lead with the visitor’s experience, not a personal profile or consultation offer. Begin with a useful reflection that can be tried immediately.</w:t>
-      </w:r>
-    </w:p>
-    <w:p>
-      <w:pPr>
-        <w:pStyle w:val="ListBullet"/>
-      </w:pPr>
-      <w:r>
-        <w:t>Use a clear learning path: notice an experience, understand the relevant idea, examine an ordinary example, try an action, and review what changed. Every main lesson should connect understanding with practice.</w:t>
-      </w:r>
-    </w:p>
-    <w:p>
-      <w:pPr>
-        <w:pStyle w:val="ListBullet"/>
-      </w:pPr>
-      <w:r>
-        <w:t>Make the complete core philosophy freely readable on the page: the original Mula Siddhanta, one Shakti, the two levels, witnessing, surrender, Bhakti and Jnana, discernment, scriptural pointers, responsibility, and the Beautiful World vision.</w:t>
-      </w:r>
-    </w:p>
-    <w:p>
-      <w:pPr>
-        <w:pStyle w:val="ListBullet"/>
-      </w:pPr>
-      <w:r>
-        <w:t>Use calm, readable, mobile-friendly pages, meaningful headings, contents links, concrete examples, reflection prompts, and clear next steps. The design should feel like a learning companion rather than a sales page.</w:t>
-      </w:r>
-    </w:p>
-    <w:p>
-      <w:pPr>
-        <w:pStyle w:val="ListBullet"/>
-      </w:pPr>
-      <w:r>
-        <w:t>Visitors must not need to book, pay, register, submit personal information, or contact Uday to benefit from the learning content. Preserve independent judgment and freedom to disagree.</w:t>
-      </w:r>
-    </w:p>
-    <w:p>
-      <w:pPr>
-        <w:pStyle w:val="ListBullet"/>
-      </w:pPr>
-      <w:r>
-        <w:t>Remove consultation priority, promotional booking calls to action, and a separate About Me focus. Keep email unobtrusive in the footer; any personal conversation is a quiet, optional last step.</w:t>
-      </w:r>
-    </w:p>
-    <w:p>
-      <w:pPr>
-        <w:pStyle w:val="ListBullet"/>
-      </w:pPr>
-      <w:r>
-        <w:t>Do not add a donation button now. If requested later, place it quietly at the very bottom without competing with the learning experience.</w:t>
-      </w:r>
-    </w:p>
-    <w:p>
-      <w:pPr>
-        <w:pStyle w:val="ListBullet"/>
-      </w:pPr>
-      <w:r>
-        <w:t>Keep proposals, beliefs, practical observations, and evidence-based claims distinct. Support care, accountability, boundaries, and appropriate professional help; do not promise cures or guaranteed enlightenment.</w:t>
-      </w:r>
-    </w:p>
-    <w:p>
-      <w:pPr>
-        <w:pStyle w:val="Heading2"/>
-      </w:pPr>
-      <w:r>
-        <w:t>Design acceptance test</w:t>
+        <w:t>We are the Creator. We created this game of experiences and entered it. Having designed it before entering, we cannot change its design from inside the game.</w:t>
       </w:r>
     </w:p>
     <w:p>
       <w:r>
-        <w:t>Can a visitor understand an idea, reflect on their own situation, and identify one constructive next action without contacting Uday? If a page only describes the philosophy or promotes a conversation but does not help the visitor use the understanding, it is incomplete. Primary navigation and prominent links should lead to learning and practice, not booking.</w:t>
+        <w:t>Every role, thought, feeling, relationship, act of remembrance, and practical response is understood within this game. The intended state of mind remembers the shared Creator while experiencing it. Uday connects natural care, lighter attachment, quietness, and the Beautiful World vision to that recognition.</w:t>
       </w:r>
     </w:p>
     <w:p>
       <w:r>
-        <w:t>The public learning exercises are editorial applications of the reference philosophy, not claimed historical teachings or proof of outcomes. Future programmes, proposed technologies, historical experiments, scientific claims, and established beliefs must remain clearly separated.</w:t>
-      </w:r>
-    </w:p>
-    <w:p>
-      <w:pPr>
-        <w:pStyle w:val="Heading1"/>
-      </w:pPr>
-      <w:r>
-        <w:t>10. Practical experiments and communication</w:t>
-      </w:r>
-    </w:p>
-    <w:p>
-      <w:pPr>
-        <w:pStyle w:val="Heading2"/>
-      </w:pPr>
-      <w:r>
-        <w:t>Android-first working method</w:t>
-      </w:r>
-    </w:p>
-    <w:p>
-      <w:r>
-        <w:t>Because the work is often carried through an Android smartphone, the workflow should remain simple: capture an idea; send it with a real-life example; ask for an explanation, exercise, or script; review and record the result; share through an existing channel; and bring back anonymous feedback.</w:t>
-      </w:r>
-    </w:p>
-    <w:p>
-      <w:pPr>
-        <w:pStyle w:val="Heading2"/>
-      </w:pPr>
-      <w:r>
-        <w:t>Reusable prompts</w:t>
-      </w:r>
-    </w:p>
-    <w:p>
-      <w:pPr>
-        <w:pStyle w:val="ListBullet"/>
-      </w:pPr>
-      <w:r>
-        <w:t>Explain this idea in simple language for a person facing an everyday problem.</w:t>
-      </w:r>
-    </w:p>
-    <w:p>
-      <w:pPr>
-        <w:pStyle w:val="ListBullet"/>
-      </w:pPr>
-      <w:r>
-        <w:t>Turn this insight into a five-minute reflection and one practical action.</w:t>
-      </w:r>
-    </w:p>
-    <w:p>
-      <w:pPr>
-        <w:pStyle w:val="ListBullet"/>
-      </w:pPr>
-      <w:r>
-        <w:t>Challenge this claim: what is belief, what is observation, and what would count as evidence?</w:t>
-      </w:r>
-    </w:p>
-    <w:p>
-      <w:pPr>
-        <w:pStyle w:val="ListBullet"/>
-      </w:pPr>
-      <w:r>
-        <w:t>Write a respectful conversation that does not force agreement.</w:t>
-      </w:r>
-    </w:p>
-    <w:p>
-      <w:pPr>
-        <w:pStyle w:val="ListBullet"/>
-      </w:pPr>
-      <w:r>
-        <w:t>Make this suitable for a website while keeping health and spiritual claims accurate.</w:t>
-      </w:r>
-    </w:p>
-    <w:p>
-      <w:pPr>
-        <w:pStyle w:val="Heading2"/>
-      </w:pPr>
-      <w:r>
-        <w:t>Public language principles</w:t>
-      </w:r>
-    </w:p>
-    <w:p>
-      <w:r>
-        <w:t>Use “may,” “can,” “in this perspective,” and “for some people” where outcomes vary. Avoid presenting proposals as launched programmes, assistant-generated designs as historical facts, or spiritual interpretations as scientific conclusions. Invite questions. Make room for disagreement. Protect privacy and obtain consent before publishing personal stories.</w:t>
-      </w:r>
-    </w:p>
-    <w:p>
-      <w:pPr>
-        <w:pStyle w:val="Heading1"/>
-      </w:pPr>
-      <w:r>
-        <w:t>11. AI collaboration and project continuity</w:t>
-      </w:r>
-    </w:p>
-    <w:p>
-      <w:r>
-        <w:t>AI can help preserve and organize the philosophy, clarify language, challenge weak claims, write and translate lessons, design learning materials, create visual explanations, research feasibility, build practical tools, and coordinate project information. AI cannot guarantee awakening or world change, act physically without access, read every private conversation, or make other people promote the philosophy.</w:t>
-      </w:r>
-    </w:p>
-    <w:p>
-      <w:r>
-        <w:t>For future Codex work, this document is the durable project reference. The saved source guide is retained under the project’s references folder, and the website README records the continuity context. When changing the website, preserve the distinctions in this document and check whether new copy is an original belief, an interpretation, a proposal, or a claim requiring evidence.</w:t>
-      </w:r>
-    </w:p>
-    <w:p>
-      <w:pPr>
-        <w:pStyle w:val="Heading2"/>
-      </w:pPr>
-      <w:r>
-        <w:t>A concise project brief</w:t>
-      </w:r>
-    </w:p>
-    <w:p>
-      <w:r>
-        <w:t>Uday Kumar is developing Mind Clarity around a personal philosophy of one Shakti, creator-awareness, witnessing, surrender, compassion, and the aspiration for a Beautiful World. The goal is to help people recognize that they are creators inside the game they created, so clarity and care arise naturally while exploring technology that reduces unnecessary burdens. The work should communicate spiritual ideas honestly, without coercion or unsupported promises.</w:t>
-      </w:r>
-    </w:p>
-    <w:p>
-      <w:pPr>
-        <w:pStyle w:val="Heading1"/>
-      </w:pPr>
-      <w:r>
-        <w:t>12. Working summary and open questions</w:t>
-      </w:r>
-    </w:p>
-    <w:p>
-      <w:pPr>
-        <w:pStyle w:val="Heading2"/>
-      </w:pPr>
-      <w:r>
-        <w:t>The philosophy in one paragraph</w:t>
-      </w:r>
-    </w:p>
-    <w:p>
-      <w:r>
-        <w:t>There is one ultimate energy or Shakti, expressed as all existence and all roles. We are the creators who created this game and entered it for experience. Clarity grows when we remember this while laughing, crying, loving, fearing, and meeting every changing scene. The emotions can arise without inwardly touching or ruling the creator-awareness beneath them. From that recognition, care for people, nature, and the world arises naturally. The practical aim is a Beautiful World: a place shaped by clear, kind, and joyful creation.</w:t>
-      </w:r>
-    </w:p>
-    <w:p>
-      <w:pPr>
-        <w:pStyle w:val="Heading2"/>
-      </w:pPr>
-      <w:r>
-        <w:t>Open questions for future work</w:t>
-      </w:r>
-    </w:p>
-    <w:p>
-      <w:pPr>
-        <w:pStyle w:val="ListBullet"/>
-      </w:pPr>
-      <w:r>
-        <w:t>How can the philosophy be communicated across religious and non-religious audiences without collapsing important differences?</w:t>
-      </w:r>
-    </w:p>
-    <w:p>
-      <w:pPr>
-        <w:pStyle w:val="ListBullet"/>
-      </w:pPr>
-      <w:r>
-        <w:t>What small practices create observable value for willing participants?</w:t>
-      </w:r>
-    </w:p>
-    <w:p>
-      <w:pPr>
-        <w:pStyle w:val="ListBullet"/>
-      </w:pPr>
-      <w:r>
-        <w:t>How can ecological limits, fairness, governance, and access shape the technology vision?</w:t>
-      </w:r>
-    </w:p>
-    <w:p>
-      <w:pPr>
-        <w:pStyle w:val="ListBullet"/>
-      </w:pPr>
-      <w:r>
-        <w:t>Which website claims are personal philosophy, which are service descriptions, and which need external evidence?</w:t>
-      </w:r>
-    </w:p>
-    <w:p>
-      <w:pPr>
-        <w:pStyle w:val="ListBullet"/>
-      </w:pPr>
-      <w:r>
-        <w:t>What feedback would show that the work is becoming clearer, kinder, and more useful?</w:t>
+        <w:t>The movie and lotus illustrate the relationship to emotion. The possessions example relates a small part of creation to the shared Creator in living relationships. Each practice is an opportunity to understand these connections in an actual scene.</w:t>
       </w:r>
     </w:p>
     <w:p>
@@ -1179,7 +1195,12 @@
     </w:p>
     <w:p>
       <w:r>
-        <w:t>Primary source: Uday Kumar, “A Beautiful World,” Mind Clarity Consultant, version 2, 16 September 2026, including the supplied Mula Siddhanta and benefit guardrails. This organized document also incorporates the Mind Clarity website context developed in ChatGPT Work and Codex. Version 1.4 • 23 September 2026. This revision makes creator-awareness explicit throughout: we are the creators who created this game and entered it, and care arises naturally from knowing who we are rather than from repeated commands to be responsible. It also clarifies the lotus practice as living within the game without being inwardly touched by every experience.</w:t>
+        <w:t>Version 1.5 • 23 September 2026. This revision follows Uday’s clarification that the complete Creator-and-game statement must govern every teaching, example, and exercise. It replaces disconnected teaching sequences, adds the movie and possessions examples, connects steady wisdom and the Beautiful World vision to the root, and records the direction for future videos.</w:t>
+      </w:r>
+    </w:p>
+    <w:p>
+      <w:r>
+        <w:t>Primary historical source: Uday Kumar, A Beautiful World, version 2, 16 September 2026, retained unchanged. The original Mula Siddhanta remains verbatim. The ten Vedic and Upanishadic pointers are retained as contemplative references within the stated interpretation. So’ham Asmi is referenced to Isha Upanishad 16; text reference: https://sri-aurobindo.co.in/workings/sa/12/isha_e.pdf.</w:t>
       </w:r>
     </w:p>
     <w:sectPr>

</xml_diff>